<commit_message>
Atualiza quadros: posição da PGE na simulação e novas linhas na cronologia
Co-Authored-By: Claude Sonnet 5.5 <noreply@anthropic.com>
Claude-Session: https://claude.ai/code/session_01LYW94chgSPa3uczkBZgQcF
</commit_message>
<xml_diff>
--- a/saida/quadro_cronologia.docx
+++ b/saida/quadro_cronologia.docx
@@ -843,6 +843,50 @@
           </w:tcPr>
           <w:p>
             <w:r>
+              <w:t>01/03/2023</w:t>
+            </w:r>
+          </w:p>
+        </w:tc>
+        <w:tc>
+          <w:tcPr>
+            <w:tcW w:type="dxa" w:w="7824"/>
+          </w:tcPr>
+          <w:p>
+            <w:r>
+              <w:t>Parecer nº 14/2023 da Assessoria Jurídica (ASSJUR): IRRF e CSLL não incidem sobre a CENTRAL, porque o pagamento é feito pelo Banco Mundial; PIS/COFINS-Importação, ISS e CIDE-royalties incidem, e a CENTRAL é sujeito passivo. Remete o caso à PGE.</w:t>
+            </w:r>
+          </w:p>
+        </w:tc>
+      </w:tr>
+      <w:tr>
+        <w:tc>
+          <w:tcPr>
+            <w:tcW w:type="dxa" w:w="1814"/>
+          </w:tcPr>
+          <w:p>
+            <w:r>
+              <w:t>09/03/2023</w:t>
+            </w:r>
+          </w:p>
+        </w:tc>
+        <w:tc>
+          <w:tcPr>
+            <w:tcW w:type="dxa" w:w="7824"/>
+          </w:tcPr>
+          <w:p>
+            <w:r>
+              <w:t>A Coordenadoria do Sistema Jurídico da PGE distribui o Parecer 14 à Procuradoria Tributária.</w:t>
+            </w:r>
+          </w:p>
+        </w:tc>
+      </w:tr>
+      <w:tr>
+        <w:tc>
+          <w:tcPr>
+            <w:tcW w:type="dxa" w:w="1814"/>
+          </w:tcPr>
+          <w:p>
+            <w:r>
               <w:t>23/03/2023</w:t>
             </w:r>
           </w:p>
@@ -854,6 +898,116 @@
           <w:p>
             <w:r>
               <w:t>Nota Técnica sugere termo aditivo para adequar o contrato, por contradição entre as cláusulas 38.1 e 39.1/39.2 e pela incidência de impostos ainda não definida.</w:t>
+            </w:r>
+          </w:p>
+        </w:tc>
+      </w:tr>
+      <w:tr>
+        <w:tc>
+          <w:tcPr>
+            <w:tcW w:type="dxa" w:w="1814"/>
+          </w:tcPr>
+          <w:p>
+            <w:r>
+              <w:t>27/03/2023</w:t>
+            </w:r>
+          </w:p>
+        </w:tc>
+        <w:tc>
+          <w:tcPr>
+            <w:tcW w:type="dxa" w:w="7824"/>
+          </w:tcPr>
+          <w:p>
+            <w:r>
+              <w:t>Consulta à Receita Federal sobre a incidência dos tributos (sem resposta nos autos).</w:t>
+            </w:r>
+          </w:p>
+        </w:tc>
+      </w:tr>
+      <w:tr>
+        <w:tc>
+          <w:tcPr>
+            <w:tcW w:type="dxa" w:w="1814"/>
+          </w:tcPr>
+          <w:p>
+            <w:r>
+              <w:t>03 e 11/04/2023</w:t>
+            </w:r>
+          </w:p>
+        </w:tc>
+        <w:tc>
+          <w:tcPr>
+            <w:tcW w:type="dxa" w:w="7824"/>
+          </w:tcPr>
+          <w:p>
+            <w:r>
+              <w:t>Procuradoria Tributária da PGE (Manifestação nº 28 e despacho de 11/04): concorda com os tributos devidos e entende que a CENTRAL deve pagá-los diretamente, e não a MCRIT com reembolso, pela ambiguidade das cláusulas 38.1 e 39.1 e pelo risco de “cálculo por dentro”. Recomenda consultar a Receita e a Secretaria Municipal de Fazenda.</w:t>
+            </w:r>
+          </w:p>
+        </w:tc>
+      </w:tr>
+      <w:tr>
+        <w:tc>
+          <w:tcPr>
+            <w:tcW w:type="dxa" w:w="1814"/>
+          </w:tcPr>
+          <w:p>
+            <w:r>
+              <w:t>23/05/2023</w:t>
+            </w:r>
+          </w:p>
+        </w:tc>
+        <w:tc>
+          <w:tcPr>
+            <w:tcW w:type="dxa" w:w="7824"/>
+          </w:tcPr>
+          <w:p>
+            <w:r>
+              <w:t>O Subprocurador-Geral aprova o Parecer 14 e as manifestações da PGE: a CENTRAL é responsável por PIS/COFINS, ISS e CIDE-royalties do Contrato 12/2021.</w:t>
+            </w:r>
+          </w:p>
+        </w:tc>
+      </w:tr>
+      <w:tr>
+        <w:tc>
+          <w:tcPr>
+            <w:tcW w:type="dxa" w:w="1814"/>
+          </w:tcPr>
+          <w:p>
+            <w:r>
+              <w:t>13/06/2023</w:t>
+            </w:r>
+          </w:p>
+        </w:tc>
+        <w:tc>
+          <w:tcPr>
+            <w:tcW w:type="dxa" w:w="7824"/>
+          </w:tcPr>
+          <w:p>
+            <w:r>
+              <w:t>A SUPFIC pergunta se IR e contribuições devem ser recolhidos agora ou depois da resposta da Receita, e aponta aparente divergência entre os Pareceres 10 e 14.</w:t>
+            </w:r>
+          </w:p>
+        </w:tc>
+      </w:tr>
+      <w:tr>
+        <w:tc>
+          <w:tcPr>
+            <w:tcW w:type="dxa" w:w="1814"/>
+          </w:tcPr>
+          <w:p>
+            <w:r>
+              <w:t>04/07/2023</w:t>
+            </w:r>
+          </w:p>
+        </w:tc>
+        <w:tc>
+          <w:tcPr>
+            <w:tcW w:type="dxa" w:w="7824"/>
+          </w:tcPr>
+          <w:p>
+            <w:r>
+              <w:t>A ASSJUR conclui que a divergência é apenas aparente: o Parecer 10 trata da relação contratual e o Parecer 14, da incidência e da sujeição passiva perante o Fisco.</w:t>
             </w:r>
           </w:p>
         </w:tc>

</xml_diff>